<commit_message>
Proper document titles: '<Subject> - <Document Type>', explanations in a description column
- engine/core/titles.py: bracket split, title case (codes, units, acronyms kept), type/subject swap
- document / mdl_rule / gate_rule: new description field; rule titles '{name} - Type'; mdl sync
  maintains title and description; 2,061 rule documents and 177 single documents retitled, gates retitled
- MDL, release control (release plan, gates, gate rules) and procedure cover pages show the description
- fire water tanks A/B in one field-erected API 650 package (MR-ME-017) with one datasheet

Co-Authored-By: Claude Opus 5.5 <noreply@anthropic.com>
Claude-Session: https://claude.ai/code/session_01TuQPCZMPzEzscTVqEEHFMo
</commit_message>
<xml_diff>
--- a/output/procedures/ALP-EPC-00000-GE-PLN-0001.docx
+++ b/output/procedures/ALP-EPC-00000-GE-PLN-0001.docx
@@ -12,7 +12,7 @@
         </w:rPr>
         <w:t>Alpilla 600 MW Combined Cycle Power Plant</w:t>
         <w:br/>
-        <w:t>Engineering execution plan (workflow, interfaces, timeline)</w:t>
+        <w:t>Engineering Execution Plan</w:t>
       </w:r>
     </w:p>
     <w:tbl>
@@ -60,6 +60,44 @@
                 <w:sz w:val="16"/>
               </w:rPr>
               <w:t>ALP-EPC-00000-GE-PLN-0001</w:t>
+            </w:r>
+          </w:p>
+        </w:tc>
+      </w:tr>
+      <w:tr>
+        <w:trPr>
+          <w:cantSplit w:val="true"/>
+        </w:trPr>
+        <w:tc>
+          <w:tcPr>
+            <w:tcW w:type="dxa" w:w="2835"/>
+          </w:tcPr>
+          <w:p>
+            <w:pPr>
+              <w:spacing w:after="0"/>
+            </w:pPr>
+            <w:r>
+              <w:rPr>
+                <w:b/>
+                <w:sz w:val="16"/>
+              </w:rPr>
+              <w:t>Description</w:t>
+            </w:r>
+          </w:p>
+        </w:tc>
+        <w:tc>
+          <w:tcPr>
+            <w:tcW w:type="dxa" w:w="7030"/>
+          </w:tcPr>
+          <w:p>
+            <w:pPr>
+              <w:spacing w:after="0"/>
+            </w:pPr>
+            <w:r>
+              <w:rPr>
+                <w:sz w:val="16"/>
+              </w:rPr>
+              <w:t>workflow, interfaces, timeline</w:t>
             </w:r>
           </w:p>
         </w:tc>
@@ -773,7 +811,7 @@
               <w:rPr>
                 <w:sz w:val="15"/>
               </w:rPr>
-              <w:t>29,888</w:t>
+              <w:t>29,886</w:t>
             </w:r>
           </w:p>
         </w:tc>
@@ -1071,7 +1109,7 @@
               <w:rPr>
                 <w:sz w:val="15"/>
               </w:rPr>
-              <w:t>16,506</w:t>
+              <w:t>16,498</w:t>
             </w:r>
           </w:p>
         </w:tc>
@@ -1550,7 +1588,7 @@
               <w:rPr>
                 <w:sz w:val="15"/>
               </w:rPr>
-              <w:t>2027-07-13</w:t>
+              <w:t>2027-07-14</w:t>
             </w:r>
           </w:p>
         </w:tc>
@@ -1667,7 +1705,7 @@
               <w:rPr>
                 <w:sz w:val="15"/>
               </w:rPr>
-              <w:t>28,480</w:t>
+              <w:t>28,472</w:t>
             </w:r>
           </w:p>
         </w:tc>
@@ -1736,7 +1774,7 @@
               <w:rPr>
                 <w:sz w:val="15"/>
               </w:rPr>
-              <w:t>656</w:t>
+              <w:t>655</w:t>
             </w:r>
           </w:p>
         </w:tc>
@@ -1752,7 +1790,7 @@
               <w:rPr>
                 <w:sz w:val="15"/>
               </w:rPr>
-              <w:t>196</w:t>
+              <w:t>195</w:t>
             </w:r>
           </w:p>
         </w:tc>
@@ -1816,7 +1854,7 @@
               <w:rPr>
                 <w:sz w:val="15"/>
               </w:rPr>
-              <w:t>13,418</w:t>
+              <w:t>13,390</w:t>
             </w:r>
           </w:p>
         </w:tc>
@@ -2114,7 +2152,7 @@
               <w:rPr>
                 <w:sz w:val="15"/>
               </w:rPr>
-              <w:t>18,007</w:t>
+              <w:t>17,989</w:t>
             </w:r>
           </w:p>
         </w:tc>
@@ -2457,7 +2495,7 @@
     </w:p>
     <w:p>
       <w:r>
-        <w:t>Total 2238 documents, 212,325 hours: EPC document preparation incl. checking and the plant 3D model; for supplier documents the EPC review. Site support, expediting and management are budgeted separately.</w:t>
+        <w:t>Total 2237 documents, 212,261 hours: EPC document preparation incl. checking and the plant 3D model; for supplier documents the EPC review. Site support, expediting and management are budgeted separately.</w:t>
       </w:r>
     </w:p>
     <w:p>
@@ -3012,7 +3050,7 @@
               <w:rPr>
                 <w:sz w:val="15"/>
               </w:rPr>
-              <w:t>201,780</w:t>
+              <w:t>201,774</w:t>
             </w:r>
           </w:p>
         </w:tc>
@@ -3097,7 +3135,7 @@
               <w:rPr>
                 <w:sz w:val="15"/>
               </w:rPr>
-              <w:t>7,983</w:t>
+              <w:t>7,909</w:t>
             </w:r>
           </w:p>
         </w:tc>
@@ -4410,7 +4448,7 @@
               <w:rPr>
                 <w:sz w:val="14"/>
               </w:rPr>
-              <w:t>213</w:t>
+              <w:t>212</w:t>
             </w:r>
           </w:p>
         </w:tc>
@@ -5975,7 +6013,7 @@
               <w:rPr>
                 <w:sz w:val="14"/>
               </w:rPr>
-              <w:t>581</w:t>
+              <w:t>575</w:t>
             </w:r>
           </w:p>
         </w:tc>
@@ -10562,7 +10600,7 @@
               <w:rPr>
                 <w:sz w:val="14"/>
               </w:rPr>
-              <w:t>33</w:t>
+              <w:t>34</w:t>
             </w:r>
           </w:p>
         </w:tc>
@@ -10642,7 +10680,7 @@
               <w:rPr>
                 <w:sz w:val="14"/>
               </w:rPr>
-              <w:t>161</w:t>
+              <w:t>160</w:t>
             </w:r>
           </w:p>
         </w:tc>
@@ -10790,7 +10828,7 @@
               <w:rPr>
                 <w:sz w:val="14"/>
               </w:rPr>
-              <w:t>53</w:t>
+              <w:t>51</w:t>
             </w:r>
           </w:p>
         </w:tc>
@@ -10950,7 +10988,7 @@
               <w:rPr>
                 <w:sz w:val="14"/>
               </w:rPr>
-              <w:t>613</w:t>
+              <w:t>611</w:t>
             </w:r>
           </w:p>
         </w:tc>
@@ -11019,7 +11057,7 @@
               <w:rPr>
                 <w:sz w:val="14"/>
               </w:rPr>
-              <w:t>33</w:t>
+              <w:t>34</w:t>
             </w:r>
           </w:p>
         </w:tc>
@@ -11179,7 +11217,7 @@
               <w:rPr>
                 <w:sz w:val="14"/>
               </w:rPr>
-              <w:t>424</w:t>
+              <w:t>425</w:t>
             </w:r>
           </w:p>
         </w:tc>
@@ -12739,7 +12777,7 @@
     </w:p>
     <w:p>
       <w:r>
-        <w:t>Engineering load per month: hours of each EPC document as booked by the levelled timeline (spread over its preparation when not levelled); 180 tender-stage documents (10,657 h) were prepared in the bid and are excluded; FTE at 150 h / month.</w:t>
+        <w:t>Engineering load per month: hours of each EPC document as booked by the levelled timeline (spread over its preparation when not levelled); 180 tender-stage documents (10,667 h) were prepared in the bid and are excluded; FTE at 150 h / month.</w:t>
       </w:r>
     </w:p>
     <w:tbl>
@@ -13642,7 +13680,7 @@
               <w:rPr>
                 <w:sz w:val="14"/>
               </w:rPr>
-              <w:t>1,732</w:t>
+              <w:t>1,729</w:t>
             </w:r>
           </w:p>
         </w:tc>
@@ -13720,7 +13758,7 @@
               <w:rPr>
                 <w:sz w:val="14"/>
               </w:rPr>
-              <w:t>18,023</w:t>
+              <w:t>18,020</w:t>
             </w:r>
           </w:p>
         </w:tc>
@@ -13773,7 +13811,7 @@
               <w:rPr>
                 <w:sz w:val="14"/>
               </w:rPr>
-              <w:t>4,481</w:t>
+              <w:t>4,485</w:t>
             </w:r>
           </w:p>
         </w:tc>
@@ -13885,7 +13923,7 @@
               <w:rPr>
                 <w:sz w:val="14"/>
               </w:rPr>
-              <w:t>1,677</w:t>
+              <w:t>1,671</w:t>
             </w:r>
           </w:p>
         </w:tc>
@@ -13948,7 +13986,7 @@
               <w:rPr>
                 <w:sz w:val="14"/>
               </w:rPr>
-              <w:t>977</w:t>
+              <w:t>934</w:t>
             </w:r>
           </w:p>
         </w:tc>
@@ -13964,7 +14002,7 @@
               <w:rPr>
                 <w:sz w:val="14"/>
               </w:rPr>
-              <w:t>19,648</w:t>
+              <w:t>19,603</w:t>
             </w:r>
           </w:p>
         </w:tc>
@@ -14017,7 +14055,7 @@
               <w:rPr>
                 <w:sz w:val="14"/>
               </w:rPr>
-              <w:t>5,174</w:t>
+              <w:t>5,175</w:t>
             </w:r>
           </w:p>
         </w:tc>
@@ -14049,7 +14087,7 @@
               <w:rPr>
                 <w:sz w:val="14"/>
               </w:rPr>
-              <w:t>1,377</w:t>
+              <w:t>1,376</w:t>
             </w:r>
           </w:p>
         </w:tc>
@@ -14129,7 +14167,7 @@
               <w:rPr>
                 <w:sz w:val="14"/>
               </w:rPr>
-              <w:t>226</w:t>
+              <w:t>219</w:t>
             </w:r>
           </w:p>
         </w:tc>
@@ -14192,7 +14230,7 @@
               <w:rPr>
                 <w:sz w:val="14"/>
               </w:rPr>
-              <w:t>2,029</w:t>
+              <w:t>2,042</w:t>
             </w:r>
           </w:p>
         </w:tc>
@@ -14208,7 +14246,7 @@
               <w:rPr>
                 <w:sz w:val="14"/>
               </w:rPr>
-              <w:t>21,795</w:t>
+              <w:t>21,802</w:t>
             </w:r>
           </w:p>
         </w:tc>
@@ -14261,7 +14299,7 @@
               <w:rPr>
                 <w:sz w:val="14"/>
               </w:rPr>
-              <w:t>4,949</w:t>
+              <w:t>4,948</w:t>
             </w:r>
           </w:p>
         </w:tc>
@@ -14293,7 +14331,7 @@
               <w:rPr>
                 <w:sz w:val="14"/>
               </w:rPr>
-              <w:t>1,318</w:t>
+              <w:t>1,319</w:t>
             </w:r>
           </w:p>
         </w:tc>
@@ -14436,7 +14474,7 @@
               <w:rPr>
                 <w:sz w:val="14"/>
               </w:rPr>
-              <w:t>2,669</w:t>
+              <w:t>2,672</w:t>
             </w:r>
           </w:p>
         </w:tc>
@@ -14452,7 +14490,7 @@
               <w:rPr>
                 <w:sz w:val="14"/>
               </w:rPr>
-              <w:t>20,632</w:t>
+              <w:t>20,635</w:t>
             </w:r>
           </w:p>
         </w:tc>
@@ -14505,7 +14543,7 @@
               <w:rPr>
                 <w:sz w:val="14"/>
               </w:rPr>
-              <w:t>4,144</w:t>
+              <w:t>4,137</w:t>
             </w:r>
           </w:p>
         </w:tc>
@@ -14569,7 +14607,7 @@
               <w:rPr>
                 <w:sz w:val="14"/>
               </w:rPr>
-              <w:t>327</w:t>
+              <w:t>326</w:t>
             </w:r>
           </w:p>
         </w:tc>
@@ -14585,7 +14623,7 @@
               <w:rPr>
                 <w:sz w:val="14"/>
               </w:rPr>
-              <w:t>41</w:t>
+              <w:t>39</w:t>
             </w:r>
           </w:p>
         </w:tc>
@@ -14601,7 +14639,7 @@
               <w:rPr>
                 <w:sz w:val="14"/>
               </w:rPr>
-              <w:t>2,193</w:t>
+              <w:t>2,192</w:t>
             </w:r>
           </w:p>
         </w:tc>
@@ -14679,7 +14717,7 @@
               <w:rPr>
                 <w:sz w:val="14"/>
               </w:rPr>
-              <w:t>1,832</w:t>
+              <w:t>1,854</w:t>
             </w:r>
           </w:p>
         </w:tc>
@@ -14695,7 +14733,7 @@
               <w:rPr>
                 <w:sz w:val="14"/>
               </w:rPr>
-              <w:t>17,851</w:t>
+              <w:t>17,863</w:t>
             </w:r>
           </w:p>
         </w:tc>
@@ -14748,7 +14786,7 @@
               <w:rPr>
                 <w:sz w:val="14"/>
               </w:rPr>
-              <w:t>1,194</w:t>
+              <w:t>1,198</w:t>
             </w:r>
           </w:p>
         </w:tc>
@@ -14780,7 +14818,7 @@
               <w:rPr>
                 <w:sz w:val="14"/>
               </w:rPr>
-              <w:t>1,316</w:t>
+              <w:t>1,318</w:t>
             </w:r>
           </w:p>
         </w:tc>
@@ -14828,7 +14866,7 @@
               <w:rPr>
                 <w:sz w:val="14"/>
               </w:rPr>
-              <w:t>24</w:t>
+              <w:t>26</w:t>
             </w:r>
           </w:p>
         </w:tc>
@@ -14923,7 +14961,7 @@
               <w:rPr>
                 <w:sz w:val="14"/>
               </w:rPr>
-              <w:t>124</w:t>
+              <w:t>127</w:t>
             </w:r>
           </w:p>
         </w:tc>
@@ -14939,7 +14977,7 @@
               <w:rPr>
                 <w:sz w:val="14"/>
               </w:rPr>
-              <w:t>12,863</w:t>
+              <w:t>12,874</w:t>
             </w:r>
           </w:p>
         </w:tc>
@@ -15296,7 +15334,7 @@
               <w:rPr>
                 <w:sz w:val="14"/>
               </w:rPr>
-              <w:t>365</w:t>
+              <w:t>366</w:t>
             </w:r>
           </w:p>
         </w:tc>
@@ -15419,7 +15457,7 @@
               <w:rPr>
                 <w:sz w:val="14"/>
               </w:rPr>
-              <w:t>10,095</w:t>
+              <w:t>10,096</w:t>
             </w:r>
           </w:p>
         </w:tc>
@@ -15503,7 +15541,7 @@
               <w:rPr>
                 <w:sz w:val="14"/>
               </w:rPr>
-              <w:t>1,293</w:t>
+              <w:t>1,294</w:t>
             </w:r>
           </w:p>
         </w:tc>
@@ -15658,7 +15696,7 @@
               <w:rPr>
                 <w:sz w:val="14"/>
               </w:rPr>
-              <w:t>9,461</w:t>
+              <w:t>9,462</w:t>
             </w:r>
           </w:p>
         </w:tc>
@@ -15742,7 +15780,7 @@
               <w:rPr>
                 <w:sz w:val="14"/>
               </w:rPr>
-              <w:t>1,070</w:t>
+              <w:t>1,092</w:t>
             </w:r>
           </w:p>
         </w:tc>
@@ -15803,7 +15841,7 @@
               <w:rPr>
                 <w:sz w:val="14"/>
               </w:rPr>
-              <w:t>2,187</w:t>
+              <w:t>2,186</w:t>
             </w:r>
           </w:p>
         </w:tc>
@@ -15895,7 +15933,7 @@
               <w:rPr>
                 <w:sz w:val="14"/>
               </w:rPr>
-              <w:t>8,729</w:t>
+              <w:t>8,750</w:t>
             </w:r>
           </w:p>
         </w:tc>
@@ -15979,7 +16017,7 @@
               <w:rPr>
                 <w:sz w:val="14"/>
               </w:rPr>
-              <w:t>79</w:t>
+              <w:t>54</w:t>
             </w:r>
           </w:p>
         </w:tc>
@@ -16040,7 +16078,7 @@
               <w:rPr>
                 <w:sz w:val="14"/>
               </w:rPr>
-              <w:t>946</w:t>
+              <w:t>948</w:t>
             </w:r>
           </w:p>
         </w:tc>
@@ -16132,7 +16170,7 @@
               <w:rPr>
                 <w:sz w:val="14"/>
               </w:rPr>
-              <w:t>6,652</w:t>
+              <w:t>6,629</w:t>
             </w:r>
           </w:p>
         </w:tc>
@@ -19213,7 +19251,7 @@
     </w:p>
     <w:p>
       <w:r>
-        <w:t>Peak 2027-03: 21,795 h (about 145 FTE).</w:t>
+        <w:t>Peak 2027-03: 21,802 h (about 145 FTE).</w:t>
       </w:r>
     </w:p>
     <w:p>
@@ -24090,7 +24128,7 @@
               <w:rPr>
                 <w:sz w:val="14"/>
               </w:rPr>
-              <w:t>149</w:t>
+              <w:t>75</w:t>
             </w:r>
           </w:p>
         </w:tc>
@@ -26625,7 +26663,7 @@
               <w:rPr>
                 <w:sz w:val="14"/>
               </w:rPr>
-              <w:t>Terminal points and interface data - power island</w:t>
+              <w:t>Power Island - Terminal Points and Interface Data</w:t>
             </w:r>
           </w:p>
         </w:tc>
@@ -26726,7 +26764,7 @@
               <w:rPr>
                 <w:sz w:val="14"/>
               </w:rPr>
-              <w:t>Division of responsibility - power island and balance of plant</w:t>
+              <w:t>Power Island and Balance of Plant - Division of Responsibility</w:t>
             </w:r>
           </w:p>
         </w:tc>
@@ -26827,7 +26865,7 @@
               <w:rPr>
                 <w:sz w:val="14"/>
               </w:rPr>
-              <w:t>Power island interface requirements to the EPC</w:t>
+              <w:t>Power Island Interface Requirements to the EPC</w:t>
             </w:r>
           </w:p>
         </w:tc>
@@ -26928,7 +26966,7 @@
               <w:rPr>
                 <w:sz w:val="14"/>
               </w:rPr>
-              <w:t>Generator step-up transformers datasheet</w:t>
+              <w:t>Generator Step-Up Transformers - Supplier Certified Datasheets and Performance Curves</w:t>
             </w:r>
           </w:p>
         </w:tc>
@@ -27029,7 +27067,7 @@
               <w:rPr>
                 <w:sz w:val="14"/>
               </w:rPr>
-              <w:t>Generator step-up transformers - GA, installation and maintenance</w:t>
+              <w:t>Generator Step-Up Transformers - Supplier GA Drawings</w:t>
             </w:r>
           </w:p>
         </w:tc>
@@ -27130,7 +27168,7 @@
               <w:rPr>
                 <w:sz w:val="14"/>
               </w:rPr>
-              <w:t>HRSG IE-HR3 datasheet</w:t>
+              <w:t>HRSG incl. SCR - Supplier Certified Datasheets and Performance Curves</w:t>
             </w:r>
           </w:p>
         </w:tc>
@@ -27231,7 +27269,7 @@
               <w:rPr>
                 <w:sz w:val="14"/>
               </w:rPr>
-              <w:t>HRSG IE-HR3 - GA, erection and maintenance</w:t>
+              <w:t>HRSG incl. SCR - Supplier GA Drawings</w:t>
             </w:r>
           </w:p>
         </w:tc>
@@ -27332,7 +27370,7 @@
               <w:rPr>
                 <w:sz w:val="14"/>
               </w:rPr>
-              <w:t>Gas turbine IE-9H.02 datasheet</w:t>
+              <w:t>Gas Turbine Package incl. Auxiliaries - Supplier Certified Datasheets and Performance Curves</w:t>
             </w:r>
           </w:p>
         </w:tc>
@@ -27433,7 +27471,7 @@
               <w:rPr>
                 <w:sz w:val="14"/>
               </w:rPr>
-              <w:t>Gas turbine and generator - GA, maintenance and installation</w:t>
+              <w:t>Gas Turbine Package incl. Auxiliaries - Supplier GA Drawings</w:t>
             </w:r>
           </w:p>
         </w:tc>
@@ -27534,7 +27572,7 @@
               <w:rPr>
                 <w:sz w:val="14"/>
               </w:rPr>
-              <w:t>Power island arrangement - installation and maintenance spaces</w:t>
+              <w:t>Power Island Arrangement - Installation and Maintenance Spaces</w:t>
             </w:r>
           </w:p>
         </w:tc>
@@ -27635,7 +27673,7 @@
               <w:rPr>
                 <w:sz w:val="14"/>
               </w:rPr>
-              <w:t>Power island thermal performance data (heat balance)</w:t>
+              <w:t>Power Island Thermal Performance Data</w:t>
             </w:r>
           </w:p>
         </w:tc>
@@ -27736,7 +27774,7 @@
               <w:rPr>
                 <w:sz w:val="14"/>
               </w:rPr>
-              <w:t>Power island off-design heat balances (case book)</w:t>
+              <w:t>Power Island Off-Design Heat Balances</w:t>
             </w:r>
           </w:p>
         </w:tc>
@@ -27837,7 +27875,7 @@
               <w:rPr>
                 <w:sz w:val="14"/>
               </w:rPr>
-              <w:t>Generators, GCB and isolated phase busduct datasheet</w:t>
+              <w:t>Generators, Excitation, GCB and Busducts - Supplier Certified Datasheets and Performance Curves</w:t>
             </w:r>
           </w:p>
         </w:tc>
@@ -27938,7 +27976,7 @@
               <w:rPr>
                 <w:sz w:val="14"/>
               </w:rPr>
-              <w:t>Steam turbine IE-ST3R datasheet</w:t>
+              <w:t>Steam Turbine and Condenser - Supplier Certified Datasheets and Performance Curves</w:t>
             </w:r>
           </w:p>
         </w:tc>
@@ -28039,7 +28077,7 @@
               <w:rPr>
                 <w:sz w:val="14"/>
               </w:rPr>
-              <w:t>Steam turbine, generator and condenser - GA, maintenance</w:t>
+              <w:t>Steam Turbine and Condenser - Supplier GA Drawings</w:t>
             </w:r>
           </w:p>
         </w:tc>
@@ -28140,7 +28178,7 @@
               <w:rPr>
                 <w:sz w:val="14"/>
               </w:rPr>
-              <w:t>Seawater-cooled surface condenser datasheet</w:t>
+              <w:t>Seawater-Cooled Surface Condenser - Datasheet</w:t>
             </w:r>
           </w:p>
         </w:tc>
@@ -28241,7 +28279,7 @@
               <w:rPr>
                 <w:sz w:val="14"/>
               </w:rPr>
-              <w:t>Supplier inspection and test plan - Generator step-up transformers (IEC)</w:t>
+              <w:t>Generator Step-Up Transformers - Supplier Inspection and Test Plan</w:t>
             </w:r>
           </w:p>
         </w:tc>
@@ -28342,7 +28380,7 @@
               <w:rPr>
                 <w:sz w:val="14"/>
               </w:rPr>
-              <w:t>Supplier inspection and test plan - HRSG incl. SCR (IEC)</w:t>
+              <w:t>HRSG incl. SCR - Supplier Inspection and Test Plan</w:t>
             </w:r>
           </w:p>
         </w:tc>
@@ -28443,7 +28481,7 @@
               <w:rPr>
                 <w:sz w:val="14"/>
               </w:rPr>
-              <w:t>Supplier certified datasheets and performance curves - Turbine control system (IEC)</w:t>
+              <w:t>Turbine Control System - Supplier Certified Datasheets and Performance Curves</w:t>
             </w:r>
           </w:p>
         </w:tc>
@@ -28544,7 +28582,7 @@
               <w:rPr>
                 <w:sz w:val="14"/>
               </w:rPr>
-              <w:t>Supplier inspection and test plan - Turbine control system (IEC)</w:t>
+              <w:t>Turbine Control System - Supplier Inspection and Test Plan</w:t>
             </w:r>
           </w:p>
         </w:tc>
@@ -28645,7 +28683,7 @@
               <w:rPr>
                 <w:sz w:val="14"/>
               </w:rPr>
-              <w:t>Supplier inspection and test plan - Generators, excitation, GCB and busducts (IEC)</w:t>
+              <w:t>Generators, Excitation, GCB and Busducts - Supplier Inspection and Test Plan</w:t>
             </w:r>
           </w:p>
         </w:tc>
@@ -28746,7 +28784,7 @@
               <w:rPr>
                 <w:sz w:val="14"/>
               </w:rPr>
-              <w:t>Supplier inspection and test plan - Steam turbine and condenser (IEC)</w:t>
+              <w:t>Steam Turbine and Condenser - Supplier Inspection and Test Plan</w:t>
             </w:r>
           </w:p>
         </w:tc>
@@ -28847,7 +28885,7 @@
               <w:rPr>
                 <w:sz w:val="14"/>
               </w:rPr>
-              <w:t>Supplier foundation loads and anchor bolt drawings - Generator step-up transformers (IEC)</w:t>
+              <w:t>Generator Step-Up Transformers - Supplier Foundation Loads and Anchor Bolt Drawings</w:t>
             </w:r>
           </w:p>
         </w:tc>
@@ -28948,7 +28986,7 @@
               <w:rPr>
                 <w:sz w:val="14"/>
               </w:rPr>
-              <w:t>Foundation load data and anchor bolt drawings - HRSG</w:t>
+              <w:t>HRSG incl. SCR - Supplier Foundation Loads and Anchor Bolt Drawings</w:t>
             </w:r>
           </w:p>
         </w:tc>
@@ -29049,7 +29087,7 @@
               <w:rPr>
                 <w:sz w:val="14"/>
               </w:rPr>
-              <w:t>Foundation load data and anchor bolt drawings - GT and generator</w:t>
+              <w:t>Gas Turbine Package incl. Auxiliaries - Supplier Foundation Loads and Anchor Bolt Drawings</w:t>
             </w:r>
           </w:p>
         </w:tc>
@@ -29150,7 +29188,7 @@
               <w:rPr>
                 <w:sz w:val="14"/>
               </w:rPr>
-              <w:t>Supplier GA drawings - Turbine control system (IEC)</w:t>
+              <w:t>Turbine Control System - Supplier GA Drawings</w:t>
             </w:r>
           </w:p>
         </w:tc>
@@ -29251,7 +29289,7 @@
               <w:rPr>
                 <w:sz w:val="14"/>
               </w:rPr>
-              <w:t>Supplier foundation loads and anchor bolt drawings - Generators, excitation, GCB and busducts (IEC)</w:t>
+              <w:t>Generators, Excitation, GCB and Busducts - Supplier Foundation Loads and Anchor Bolt Drawings</w:t>
             </w:r>
           </w:p>
         </w:tc>
@@ -29352,7 +29390,7 @@
               <w:rPr>
                 <w:sz w:val="14"/>
               </w:rPr>
-              <w:t>Supplier GA drawings - Generators, excitation, GCB and busducts (IEC)</w:t>
+              <w:t>Generators, Excitation, GCB and Busducts - Supplier GA Drawings</w:t>
             </w:r>
           </w:p>
         </w:tc>
@@ -29453,7 +29491,7 @@
               <w:rPr>
                 <w:sz w:val="14"/>
               </w:rPr>
-              <w:t>Terminal point nozzle loads (IF-001 attachment A)</w:t>
+              <w:t>Terminal Point Nozzle Loads</w:t>
             </w:r>
           </w:p>
         </w:tc>
@@ -29554,7 +29592,7 @@
               <w:rPr>
                 <w:sz w:val="14"/>
               </w:rPr>
-              <w:t>Power island single line diagram (generators, GCB, GSU, UAT tap-offs, SFC)</w:t>
+              <w:t>Power Island Single Line Diagram</w:t>
             </w:r>
           </w:p>
         </w:tc>
@@ -29655,7 +29693,7 @@
               <w:rPr>
                 <w:sz w:val="14"/>
               </w:rPr>
-              <w:t>Supplier I/O list, control philosophy and interface signals - Generator step-up transformers (IEC)</w:t>
+              <w:t>Generator Step-Up Transformers - Supplier I/O List, Control Philosophy and Interface Signals</w:t>
             </w:r>
           </w:p>
         </w:tc>
@@ -29756,7 +29794,7 @@
               <w:rPr>
                 <w:sz w:val="14"/>
               </w:rPr>
-              <w:t>Supplier design calculations - Generator step-up transformers (IEC)</w:t>
+              <w:t>Generator Step-Up Transformers - Supplier Design Calculations</w:t>
             </w:r>
           </w:p>
         </w:tc>
@@ -29857,7 +29895,7 @@
               <w:rPr>
                 <w:sz w:val="14"/>
               </w:rPr>
-              <w:t>Supplier I/O list, control philosophy and interface signals - HRSG incl. SCR (IEC)</w:t>
+              <w:t>HRSG incl. SCR - Supplier I/O List, Control Philosophy and Interface Signals</w:t>
             </w:r>
           </w:p>
         </w:tc>
@@ -29958,7 +29996,7 @@
               <w:rPr>
                 <w:sz w:val="14"/>
               </w:rPr>
-              <w:t>Supplier design calculations - HRSG incl. SCR (IEC)</w:t>
+              <w:t>HRSG incl. SCR - Supplier Design Calculations</w:t>
             </w:r>
           </w:p>
         </w:tc>
@@ -30059,7 +30097,7 @@
               <w:rPr>
                 <w:sz w:val="14"/>
               </w:rPr>
-              <w:t>Power island electrical load list</w:t>
+              <w:t>Power Island Electrical Load List</w:t>
             </w:r>
           </w:p>
         </w:tc>
@@ -30160,7 +30198,7 @@
               <w:rPr>
                 <w:sz w:val="14"/>
               </w:rPr>
-              <w:t>Supplier I/O list, control philosophy and interface signals - Gas turbine package incl. auxiliaries (IEC)</w:t>
+              <w:t>Gas Turbine Package incl. Auxiliaries - Supplier I/O List, Control Philosophy and Interface Signals</w:t>
             </w:r>
           </w:p>
         </w:tc>
@@ -30261,7 +30299,7 @@
               <w:rPr>
                 <w:sz w:val="14"/>
               </w:rPr>
-              <w:t>Supplier design calculations - Gas turbine package incl. auxiliaries (IEC)</w:t>
+              <w:t>Gas Turbine Package incl. Auxiliaries - Supplier Design Calculations</w:t>
             </w:r>
           </w:p>
         </w:tc>
@@ -30362,7 +30400,7 @@
               <w:rPr>
                 <w:sz w:val="14"/>
               </w:rPr>
-              <w:t>Supplier design calculations - Turbine control system (IEC)</w:t>
+              <w:t>Turbine Control System - Supplier Design Calculations</w:t>
             </w:r>
           </w:p>
         </w:tc>
@@ -30463,7 +30501,7 @@
               <w:rPr>
                 <w:sz w:val="14"/>
               </w:rPr>
-              <w:t>Supplier I/O list, control philosophy and interface signals - Generators, excitation, GCB and busducts (IEC)</w:t>
+              <w:t>Generators, Excitation, GCB and Busducts - Supplier I/O List, Control Philosophy and Interface Signals</w:t>
             </w:r>
           </w:p>
         </w:tc>
@@ -30564,7 +30602,7 @@
               <w:rPr>
                 <w:sz w:val="14"/>
               </w:rPr>
-              <w:t>Supplier design calculations - Generators, excitation, GCB and busducts (IEC)</w:t>
+              <w:t>Generators, Excitation, GCB and Busducts - Supplier Design Calculations</w:t>
             </w:r>
           </w:p>
         </w:tc>
@@ -30665,7 +30703,7 @@
               <w:rPr>
                 <w:sz w:val="14"/>
               </w:rPr>
-              <w:t>Foundation load data - ST, generator and condenser</w:t>
+              <w:t>Steam Turbine and Condenser - Supplier Foundation Loads and Anchor Bolt Drawings</w:t>
             </w:r>
           </w:p>
         </w:tc>
@@ -30766,7 +30804,7 @@
               <w:rPr>
                 <w:sz w:val="14"/>
               </w:rPr>
-              <w:t>Supplier I/O list, control philosophy and interface signals - Steam turbine and condenser (IEC)</w:t>
+              <w:t>Steam Turbine and Condenser - Supplier I/O List, Control Philosophy and Interface Signals</w:t>
             </w:r>
           </w:p>
         </w:tc>
@@ -30867,7 +30905,7 @@
               <w:rPr>
                 <w:sz w:val="14"/>
               </w:rPr>
-              <w:t>Supplier design calculations - Steam turbine and condenser (IEC)</w:t>
+              <w:t>Steam Turbine and Condenser - Supplier Design Calculations</w:t>
             </w:r>
           </w:p>
         </w:tc>
@@ -30968,7 +31006,7 @@
               <w:rPr>
                 <w:sz w:val="14"/>
               </w:rPr>
-              <w:t>Supplier electrical schematics and wiring diagrams - Generator step-up transformers (IEC)</w:t>
+              <w:t>Generator Step-Up Transformers - Supplier Electrical Schematics and Wiring Diagrams</w:t>
             </w:r>
           </w:p>
         </w:tc>
@@ -31069,7 +31107,7 @@
               <w:rPr>
                 <w:sz w:val="14"/>
               </w:rPr>
-              <w:t>Supplier instrument list and datasheets - Generator step-up transformers (IEC)</w:t>
+              <w:t>Generator Step-Up Transformers - Supplier Instrument List and Datasheets</w:t>
             </w:r>
           </w:p>
         </w:tc>
@@ -31170,7 +31208,7 @@
               <w:rPr>
                 <w:sz w:val="14"/>
               </w:rPr>
-              <w:t>Supplier electrical schematics and wiring diagrams - HRSG incl. SCR (IEC)</w:t>
+              <w:t>HRSG incl. SCR - Supplier Electrical Schematics and Wiring Diagrams</w:t>
             </w:r>
           </w:p>
         </w:tc>
@@ -31271,7 +31309,7 @@
               <w:rPr>
                 <w:sz w:val="14"/>
               </w:rPr>
-              <w:t>Supplier instrument list and datasheets - HRSG incl. SCR (IEC) - part 1 of 2</w:t>
+              <w:t>HRSG incl. SCR - Supplier Instrument List and Datasheets, Part 1 of 2</w:t>
             </w:r>
           </w:p>
         </w:tc>
@@ -31372,7 +31410,7 @@
               <w:rPr>
                 <w:sz w:val="14"/>
               </w:rPr>
-              <w:t>Supplier instrument list and datasheets - HRSG incl. SCR (IEC) - part 2 of 2</w:t>
+              <w:t>HRSG incl. SCR - Supplier Instrument List and Datasheets, Part 2 of 2</w:t>
             </w:r>
           </w:p>
         </w:tc>
@@ -31473,7 +31511,7 @@
               <w:rPr>
                 <w:sz w:val="14"/>
               </w:rPr>
-              <w:t>HRSG P&amp;IDs incl. SCR and ammonia injection</w:t>
+              <w:t>HRSG incl. SCR - Supplier P&amp;IDs</w:t>
             </w:r>
           </w:p>
         </w:tc>
@@ -31574,7 +31612,7 @@
               <w:rPr>
                 <w:sz w:val="14"/>
               </w:rPr>
-              <w:t>Supplier electrical schematics and wiring diagrams - Gas turbine package incl. auxiliaries (IEC) - part 1 of 2</w:t>
+              <w:t>Gas Turbine Package incl. Auxiliaries - Supplier Electrical Schematics and Wiring Diagrams, Part 1 of 2</w:t>
             </w:r>
           </w:p>
         </w:tc>
@@ -31675,7 +31713,7 @@
               <w:rPr>
                 <w:sz w:val="14"/>
               </w:rPr>
-              <w:t>Supplier electrical schematics and wiring diagrams - Gas turbine package incl. auxiliaries (IEC) - part 2 of 2</w:t>
+              <w:t>Gas Turbine Package incl. Auxiliaries - Supplier Electrical Schematics and Wiring Diagrams, Part 2 of 2</w:t>
             </w:r>
           </w:p>
         </w:tc>
@@ -31776,7 +31814,7 @@
               <w:rPr>
                 <w:sz w:val="14"/>
               </w:rPr>
-              <w:t>Power island noise data (ISO 10494)</w:t>
+              <w:t>Power Island Noise Data</w:t>
             </w:r>
           </w:p>
         </w:tc>
@@ -31877,7 +31915,7 @@
               <w:rPr>
                 <w:sz w:val="14"/>
               </w:rPr>
-              <w:t>Supplier instrument list and datasheets - Gas turbine package incl. auxiliaries (IEC) - part 1 of 3</w:t>
+              <w:t>Gas Turbine Package incl. Auxiliaries - Supplier Instrument List and Datasheets, Part 1 of 3</w:t>
             </w:r>
           </w:p>
         </w:tc>
@@ -31978,7 +32016,7 @@
               <w:rPr>
                 <w:sz w:val="14"/>
               </w:rPr>
-              <w:t>Supplier instrument list and datasheets - Gas turbine package incl. auxiliaries (IEC) - part 2 of 3</w:t>
+              <w:t>Gas Turbine Package incl. Auxiliaries - Supplier Instrument List and Datasheets, Part 2 of 3</w:t>
             </w:r>
           </w:p>
         </w:tc>
@@ -32079,7 +32117,7 @@
               <w:rPr>
                 <w:sz w:val="14"/>
               </w:rPr>
-              <w:t>Supplier instrument list and datasheets - Gas turbine package incl. auxiliaries (IEC) - part 3 of 3</w:t>
+              <w:t>Gas Turbine Package incl. Auxiliaries - Supplier Instrument List and Datasheets, Part 3 of 3</w:t>
             </w:r>
           </w:p>
         </w:tc>
@@ -32180,7 +32218,7 @@
               <w:rPr>
                 <w:sz w:val="14"/>
               </w:rPr>
-              <w:t>Gas turbine P&amp;IDs (fuel gas, liquid fuel, lube oil, inlet air, washing)</w:t>
+              <w:t>Gas Turbine Package incl. Auxiliaries - Supplier P&amp;IDs</w:t>
             </w:r>
           </w:p>
         </w:tc>
@@ -32281,7 +32319,7 @@
               <w:rPr>
                 <w:sz w:val="14"/>
               </w:rPr>
-              <w:t>Supplier electrical schematics and wiring diagrams - Turbine control system (IEC)</w:t>
+              <w:t>Turbine Control System - Supplier Electrical Schematics and Wiring Diagrams</w:t>
             </w:r>
           </w:p>
         </w:tc>
@@ -32382,7 +32420,7 @@
               <w:rPr>
                 <w:sz w:val="14"/>
               </w:rPr>
-              <w:t>TCS architecture and DCS integration (OPC UA, IEC 62443 zone)</w:t>
+              <w:t>TCS Architecture and DCS Integration</w:t>
             </w:r>
           </w:p>
         </w:tc>
@@ -32483,7 +32521,7 @@
               <w:rPr>
                 <w:sz w:val="14"/>
               </w:rPr>
-              <w:t>Supplier electrical schematics and wiring diagrams - Generators, excitation, GCB and busducts (IEC)</w:t>
+              <w:t>Generators, Excitation, GCB and Busducts - Supplier Electrical Schematics and Wiring Diagrams</w:t>
             </w:r>
           </w:p>
         </w:tc>
@@ -32584,7 +32622,7 @@
               <w:rPr>
                 <w:sz w:val="14"/>
               </w:rPr>
-              <w:t>Supplier instrument list and datasheets - Generators, excitation, GCB and busducts (IEC)</w:t>
+              <w:t>Generators, Excitation, GCB and Busducts - Supplier Instrument List and Datasheets</w:t>
             </w:r>
           </w:p>
         </w:tc>
@@ -32685,7 +32723,7 @@
               <w:rPr>
                 <w:sz w:val="14"/>
               </w:rPr>
-              <w:t>Supplier electrical schematics and wiring diagrams - Steam turbine and condenser (IEC)</w:t>
+              <w:t>Steam Turbine and Condenser - Supplier Electrical Schematics and Wiring Diagrams</w:t>
             </w:r>
           </w:p>
         </w:tc>
@@ -32786,7 +32824,7 @@
               <w:rPr>
                 <w:sz w:val="14"/>
               </w:rPr>
-              <w:t>Supplier instrument list and datasheets - Steam turbine and condenser (IEC) - part 1 of 2</w:t>
+              <w:t>Steam Turbine and Condenser - Supplier Instrument List and Datasheets, Part 1 of 2</w:t>
             </w:r>
           </w:p>
         </w:tc>
@@ -32887,7 +32925,7 @@
               <w:rPr>
                 <w:sz w:val="14"/>
               </w:rPr>
-              <w:t>Supplier instrument list and datasheets - Steam turbine and condenser (IEC) - part 2 of 2</w:t>
+              <w:t>Steam Turbine and Condenser - Supplier Instrument List and Datasheets, Part 2 of 2</w:t>
             </w:r>
           </w:p>
         </w:tc>
@@ -32988,7 +33026,7 @@
               <w:rPr>
                 <w:sz w:val="14"/>
               </w:rPr>
-              <w:t>Spare parts and special tools lists - Generator step-up transformers (IEC)</w:t>
+              <w:t>Generator Step-Up Transformers - Spare Parts and Special Tools Lists</w:t>
             </w:r>
           </w:p>
         </w:tc>
@@ -33089,7 +33127,7 @@
               <w:rPr>
                 <w:sz w:val="14"/>
               </w:rPr>
-              <w:t>Spare parts and special tools lists - HRSG incl. SCR (IEC)</w:t>
+              <w:t>HRSG incl. SCR - Spare Parts and Special Tools Lists</w:t>
             </w:r>
           </w:p>
         </w:tc>
@@ -33190,7 +33228,7 @@
               <w:rPr>
                 <w:sz w:val="14"/>
               </w:rPr>
-              <w:t>Power island inspection and test plans</w:t>
+              <w:t>Gas Turbine Package incl. Auxiliaries - Supplier Inspection and Test Plan</w:t>
             </w:r>
           </w:p>
         </w:tc>
@@ -33291,7 +33329,7 @@
               <w:rPr>
                 <w:sz w:val="14"/>
               </w:rPr>
-              <w:t>Spare parts and special tools lists - Gas turbine package incl. auxiliaries (IEC)</w:t>
+              <w:t>Gas Turbine Package incl. Auxiliaries - Spare Parts and Special Tools Lists</w:t>
             </w:r>
           </w:p>
         </w:tc>
@@ -33392,7 +33430,7 @@
               <w:rPr>
                 <w:sz w:val="14"/>
               </w:rPr>
-              <w:t>Spare parts and special tools lists - Turbine control system (IEC)</w:t>
+              <w:t>Turbine Control System - Spare Parts and Special Tools Lists</w:t>
             </w:r>
           </w:p>
         </w:tc>
@@ -33493,7 +33531,7 @@
               <w:rPr>
                 <w:sz w:val="14"/>
               </w:rPr>
-              <w:t>Generator capability curves and dynamic models (Grid Code)</w:t>
+              <w:t>Generator Capability Curves and Dynamic Models</w:t>
             </w:r>
           </w:p>
         </w:tc>
@@ -33594,7 +33632,7 @@
               <w:rPr>
                 <w:sz w:val="14"/>
               </w:rPr>
-              <w:t>Spare parts and special tools lists - Generators, excitation, GCB and busducts (IEC)</w:t>
+              <w:t>Generators, Excitation, GCB and Busducts - Spare Parts and Special Tools Lists</w:t>
             </w:r>
           </w:p>
         </w:tc>
@@ -33695,7 +33733,7 @@
               <w:rPr>
                 <w:sz w:val="14"/>
               </w:rPr>
-              <w:t>Generator auxiliary P&amp;IDs (H2/CO2, seal oil, stator water)</w:t>
+              <w:t>Generators, Excitation, GCB and Busducts - Supplier P&amp;IDs</w:t>
             </w:r>
           </w:p>
         </w:tc>
@@ -33796,7 +33834,7 @@
               <w:rPr>
                 <w:sz w:val="14"/>
               </w:rPr>
-              <w:t>Spare parts and special tools lists - Steam turbine and condenser (IEC)</w:t>
+              <w:t>Steam Turbine and Condenser - Spare Parts and Special Tools Lists</w:t>
             </w:r>
           </w:p>
         </w:tc>
@@ -33897,7 +33935,7 @@
               <w:rPr>
                 <w:sz w:val="14"/>
               </w:rPr>
-              <w:t>Steam turbine and condenser P&amp;IDs (lube, gland, vacuum, EHC, bypass valves)</w:t>
+              <w:t>Steam Turbine and Condenser - Supplier P&amp;IDs</w:t>
             </w:r>
           </w:p>
         </w:tc>
@@ -33998,7 +34036,7 @@
               <w:rPr>
                 <w:sz w:val="14"/>
               </w:rPr>
-              <w:t>Power island operating and control description (start-up, load, trips)</w:t>
+              <w:t>Power Island Operating and Control Description</w:t>
             </w:r>
           </w:p>
         </w:tc>
@@ -34099,7 +34137,7 @@
               <w:rPr>
                 <w:sz w:val="14"/>
               </w:rPr>
-              <w:t>Power island 3D model export (for the plant model)</w:t>
+              <w:t>Power Island 3D Model Export</w:t>
             </w:r>
           </w:p>
         </w:tc>
@@ -34200,7 +34238,7 @@
               <w:rPr>
                 <w:sz w:val="14"/>
               </w:rPr>
-              <w:t>TCS I/O list and interface signal list</w:t>
+              <w:t>Turbine Control System - Supplier I/O List, Control Philosophy and Interface Signals</w:t>
             </w:r>
           </w:p>
         </w:tc>
@@ -34301,7 +34339,7 @@
               <w:rPr>
                 <w:sz w:val="14"/>
               </w:rPr>
-              <w:t>Supplier commissioning procedures - Turbine control system (IEC)</w:t>
+              <w:t>Turbine Control System - Supplier Commissioning Procedures</w:t>
             </w:r>
           </w:p>
         </w:tc>
@@ -34402,7 +34440,7 @@
               <w:rPr>
                 <w:sz w:val="14"/>
               </w:rPr>
-              <w:t>Supplier logic diagrams - Turbine control system (IEC) - part 1 of 6</w:t>
+              <w:t>Turbine Control System - Supplier Logic Diagrams, Part 1 of 6</w:t>
             </w:r>
           </w:p>
         </w:tc>
@@ -34503,7 +34541,7 @@
               <w:rPr>
                 <w:sz w:val="14"/>
               </w:rPr>
-              <w:t>Supplier logic diagrams - Turbine control system (IEC) - part 2 of 6</w:t>
+              <w:t>Turbine Control System - Supplier Logic Diagrams, Part 2 of 6</w:t>
             </w:r>
           </w:p>
         </w:tc>
@@ -34604,7 +34642,7 @@
               <w:rPr>
                 <w:sz w:val="14"/>
               </w:rPr>
-              <w:t>Supplier logic diagrams - Turbine control system (IEC) - part 3 of 6</w:t>
+              <w:t>Turbine Control System - Supplier Logic Diagrams, Part 3 of 6</w:t>
             </w:r>
           </w:p>
         </w:tc>
@@ -34705,7 +34743,7 @@
               <w:rPr>
                 <w:sz w:val="14"/>
               </w:rPr>
-              <w:t>Supplier logic diagrams - Turbine control system (IEC) - part 4 of 6</w:t>
+              <w:t>Turbine Control System - Supplier Logic Diagrams, Part 4 of 6</w:t>
             </w:r>
           </w:p>
         </w:tc>
@@ -34806,7 +34844,7 @@
               <w:rPr>
                 <w:sz w:val="14"/>
               </w:rPr>
-              <w:t>Supplier logic diagrams - Turbine control system (IEC) - part 5 of 6</w:t>
+              <w:t>Turbine Control System - Supplier Logic Diagrams, Part 5 of 6</w:t>
             </w:r>
           </w:p>
         </w:tc>
@@ -34907,7 +34945,7 @@
               <w:rPr>
                 <w:sz w:val="14"/>
               </w:rPr>
-              <w:t>Supplier logic diagrams - Turbine control system (IEC) - part 6 of 6</w:t>
+              <w:t>Turbine Control System - Supplier Logic Diagrams, Part 6 of 6</w:t>
             </w:r>
           </w:p>
         </w:tc>
@@ -35008,7 +35046,7 @@
               <w:rPr>
                 <w:sz w:val="14"/>
               </w:rPr>
-              <w:t>Factory acceptance test procedure - Turbine control system (IEC)</w:t>
+              <w:t>Turbine Control System - Factory Acceptance Test Procedure</w:t>
             </w:r>
           </w:p>
         </w:tc>
@@ -35109,7 +35147,7 @@
               <w:rPr>
                 <w:sz w:val="14"/>
               </w:rPr>
-              <w:t>Supplier commissioning procedures - HRSG incl. SCR (IEC)</w:t>
+              <w:t>HRSG incl. SCR - Supplier Commissioning Procedures</w:t>
             </w:r>
           </w:p>
         </w:tc>
@@ -35210,7 +35248,7 @@
               <w:rPr>
                 <w:sz w:val="14"/>
               </w:rPr>
-              <w:t>Supplier installation and erection manual - Turbine control system (IEC)</w:t>
+              <w:t>Turbine Control System - Supplier Installation and Erection Manual</w:t>
             </w:r>
           </w:p>
         </w:tc>
@@ -35311,7 +35349,7 @@
               <w:rPr>
                 <w:sz w:val="14"/>
               </w:rPr>
-              <w:t>Supplier commissioning procedures - Generators, excitation, GCB and busducts (IEC)</w:t>
+              <w:t>Generators, Excitation, GCB and Busducts - Supplier Commissioning Procedures</w:t>
             </w:r>
           </w:p>
         </w:tc>
@@ -35412,7 +35450,7 @@
               <w:rPr>
                 <w:sz w:val="14"/>
               </w:rPr>
-              <w:t>Supplier commissioning procedures - Generator step-up transformers (IEC)</w:t>
+              <w:t>Generator Step-Up Transformers - Supplier Commissioning Procedures</w:t>
             </w:r>
           </w:p>
         </w:tc>
@@ -35513,7 +35551,7 @@
               <w:rPr>
                 <w:sz w:val="14"/>
               </w:rPr>
-              <w:t>Supplier commissioning procedures - Gas turbine package incl. auxiliaries (IEC)</w:t>
+              <w:t>Gas Turbine Package incl. Auxiliaries - Supplier Commissioning Procedures</w:t>
             </w:r>
           </w:p>
         </w:tc>
@@ -35614,7 +35652,7 @@
               <w:rPr>
                 <w:sz w:val="14"/>
               </w:rPr>
-              <w:t>Power island cable list (IEC scope and interfaces)</w:t>
+              <w:t>Power Island Cable List</w:t>
             </w:r>
           </w:p>
         </w:tc>
@@ -35715,7 +35753,7 @@
               <w:rPr>
                 <w:sz w:val="14"/>
               </w:rPr>
-              <w:t>Factory acceptance test procedure - HRSG incl. SCR (IEC)</w:t>
+              <w:t>HRSG incl. SCR - Factory Acceptance Test Procedure</w:t>
             </w:r>
           </w:p>
         </w:tc>
@@ -35816,7 +35854,7 @@
               <w:rPr>
                 <w:sz w:val="14"/>
               </w:rPr>
-              <w:t>Supplier operation and maintenance manual - Turbine control system (IEC)</w:t>
+              <w:t>Turbine Control System - Supplier Operation and Maintenance Manual</w:t>
             </w:r>
           </w:p>
         </w:tc>
@@ -35917,7 +35955,7 @@
               <w:rPr>
                 <w:sz w:val="14"/>
               </w:rPr>
-              <w:t>Factory acceptance test procedure - Generators, excitation, GCB and busducts (IEC)</w:t>
+              <w:t>Generators, Excitation, GCB and Busducts - Factory Acceptance Test Procedure</w:t>
             </w:r>
           </w:p>
         </w:tc>
@@ -36018,7 +36056,7 @@
               <w:rPr>
                 <w:sz w:val="14"/>
               </w:rPr>
-              <w:t>Factory acceptance test procedure - Generator step-up transformers (IEC)</w:t>
+              <w:t>Generator Step-Up Transformers - Factory Acceptance Test Procedure</w:t>
             </w:r>
           </w:p>
         </w:tc>
@@ -36119,7 +36157,7 @@
               <w:rPr>
                 <w:sz w:val="14"/>
               </w:rPr>
-              <w:t>Factory acceptance test procedure - Gas turbine package incl. auxiliaries (IEC)</w:t>
+              <w:t>Gas Turbine Package incl. Auxiliaries - Factory Acceptance Test Procedure</w:t>
             </w:r>
           </w:p>
         </w:tc>
@@ -36220,7 +36258,7 @@
               <w:rPr>
                 <w:sz w:val="14"/>
               </w:rPr>
-              <w:t>Supplier installation and erection manual - HRSG incl. SCR (IEC)</w:t>
+              <w:t>HRSG incl. SCR - Supplier Installation and Erection Manual</w:t>
             </w:r>
           </w:p>
         </w:tc>
@@ -36321,7 +36359,7 @@
               <w:rPr>
                 <w:sz w:val="14"/>
               </w:rPr>
-              <w:t>Power island erection manuals and procedures</w:t>
+              <w:t>Gas Turbine Package incl. Auxiliaries - Supplier Installation and Erection Manual</w:t>
             </w:r>
           </w:p>
         </w:tc>
@@ -36422,7 +36460,7 @@
               <w:rPr>
                 <w:sz w:val="14"/>
               </w:rPr>
-              <w:t>Factory acceptance test report - Turbine control system (IEC)</w:t>
+              <w:t>Turbine Control System - Factory Acceptance Test Report</w:t>
             </w:r>
           </w:p>
         </w:tc>
@@ -36523,7 +36561,7 @@
               <w:rPr>
                 <w:sz w:val="14"/>
               </w:rPr>
-              <w:t>Supplier commissioning procedures - Steam turbine and condenser (IEC)</w:t>
+              <w:t>Steam Turbine and Condenser - Supplier Commissioning Procedures</w:t>
             </w:r>
           </w:p>
         </w:tc>
@@ -36624,7 +36662,7 @@
               <w:rPr>
                 <w:sz w:val="14"/>
               </w:rPr>
-              <w:t>Supplier installation and erection manual - Generators, excitation, GCB and busducts (IEC)</w:t>
+              <w:t>Generators, Excitation, GCB and Busducts - Supplier Installation and Erection Manual</w:t>
             </w:r>
           </w:p>
         </w:tc>
@@ -36725,7 +36763,7 @@
               <w:rPr>
                 <w:sz w:val="14"/>
               </w:rPr>
-              <w:t>Supplier installation and erection manual - Generator step-up transformers (IEC)</w:t>
+              <w:t>Generator Step-Up Transformers - Supplier Installation and Erection Manual</w:t>
             </w:r>
           </w:p>
         </w:tc>
@@ -36826,7 +36864,7 @@
               <w:rPr>
                 <w:sz w:val="14"/>
               </w:rPr>
-              <w:t>Manufacturing record book and conformity certificates - Turbine control system (IEC)</w:t>
+              <w:t>Turbine Control System - Manufacturing Record Book and Conformity Certificates</w:t>
             </w:r>
           </w:p>
         </w:tc>
@@ -36927,7 +36965,7 @@
               <w:rPr>
                 <w:sz w:val="14"/>
               </w:rPr>
-              <w:t>Supplier operation and maintenance manual - HRSG incl. SCR (IEC)</w:t>
+              <w:t>HRSG incl. SCR - Supplier Operation and Maintenance Manual</w:t>
             </w:r>
           </w:p>
         </w:tc>
@@ -37028,7 +37066,7 @@
               <w:rPr>
                 <w:sz w:val="14"/>
               </w:rPr>
-              <w:t>Maintenance concept and long-term service offer</w:t>
+              <w:t>Maintenance Concept and Long-Term Service Offer</w:t>
             </w:r>
           </w:p>
         </w:tc>
@@ -37129,7 +37167,7 @@
               <w:rPr>
                 <w:sz w:val="14"/>
               </w:rPr>
-              <w:t>Factory acceptance test procedure - Steam turbine and condenser (IEC)</w:t>
+              <w:t>Steam Turbine and Condenser - Factory Acceptance Test Procedure</w:t>
             </w:r>
           </w:p>
         </w:tc>
@@ -37230,7 +37268,7 @@
               <w:rPr>
                 <w:sz w:val="14"/>
               </w:rPr>
-              <w:t>Supplier operation and maintenance manual - Generators, excitation, GCB and busducts (IEC)</w:t>
+              <w:t>Generators, Excitation, GCB and Busducts - Supplier Operation and Maintenance Manual</w:t>
             </w:r>
           </w:p>
         </w:tc>
@@ -37331,7 +37369,7 @@
               <w:rPr>
                 <w:sz w:val="14"/>
               </w:rPr>
-              <w:t>Supplier operation and maintenance manual - Generator step-up transformers (IEC)</w:t>
+              <w:t>Generator Step-Up Transformers - Supplier Operation and Maintenance Manual</w:t>
             </w:r>
           </w:p>
         </w:tc>
@@ -37432,7 +37470,7 @@
               <w:rPr>
                 <w:sz w:val="14"/>
               </w:rPr>
-              <w:t>Factory acceptance test report - HRSG incl. SCR (IEC)</w:t>
+              <w:t>HRSG incl. SCR - Factory Acceptance Test Report</w:t>
             </w:r>
           </w:p>
         </w:tc>
@@ -37533,7 +37571,7 @@
               <w:rPr>
                 <w:sz w:val="14"/>
               </w:rPr>
-              <w:t>Supplier installation and erection manual - Steam turbine and condenser (IEC)</w:t>
+              <w:t>Steam Turbine and Condenser - Supplier Installation and Erection Manual</w:t>
             </w:r>
           </w:p>
         </w:tc>
@@ -37634,7 +37672,7 @@
               <w:rPr>
                 <w:sz w:val="14"/>
               </w:rPr>
-              <w:t>Factory acceptance test report - Generators, excitation, GCB and busducts (IEC)</w:t>
+              <w:t>Generators, Excitation, GCB and Busducts - Factory Acceptance Test Report</w:t>
             </w:r>
           </w:p>
         </w:tc>
@@ -37735,7 +37773,7 @@
               <w:rPr>
                 <w:sz w:val="14"/>
               </w:rPr>
-              <w:t>Factory acceptance test report - Generator step-up transformers (IEC)</w:t>
+              <w:t>Generator Step-Up Transformers - Factory Acceptance Test Report</w:t>
             </w:r>
           </w:p>
         </w:tc>
@@ -37836,7 +37874,7 @@
               <w:rPr>
                 <w:sz w:val="14"/>
               </w:rPr>
-              <w:t>Manufacturing record book and conformity certificates - HRSG incl. SCR (IEC)</w:t>
+              <w:t>HRSG incl. SCR - Manufacturing Record Book and Conformity Certificates</w:t>
             </w:r>
           </w:p>
         </w:tc>
@@ -37937,7 +37975,7 @@
               <w:rPr>
                 <w:sz w:val="14"/>
               </w:rPr>
-              <w:t>Factory acceptance test report - Gas turbine package incl. auxiliaries (IEC)</w:t>
+              <w:t>Gas Turbine Package incl. Auxiliaries - Factory Acceptance Test Report</w:t>
             </w:r>
           </w:p>
         </w:tc>
@@ -38038,7 +38076,7 @@
               <w:rPr>
                 <w:sz w:val="14"/>
               </w:rPr>
-              <w:t>Manufacturing record book and conformity certificates - Generators, excitation, GCB and busducts (IEC)</w:t>
+              <w:t>Generators, Excitation, GCB and Busducts - Manufacturing Record Book and Conformity Certificates</w:t>
             </w:r>
           </w:p>
         </w:tc>
@@ -38139,7 +38177,7 @@
               <w:rPr>
                 <w:sz w:val="14"/>
               </w:rPr>
-              <w:t>Manufacturing record book and conformity certificates - Generator step-up transformers (IEC)</w:t>
+              <w:t>Generator Step-Up Transformers - Manufacturing Record Book and Conformity Certificates</w:t>
             </w:r>
           </w:p>
         </w:tc>
@@ -38240,7 +38278,7 @@
               <w:rPr>
                 <w:sz w:val="14"/>
               </w:rPr>
-              <w:t>Manufacturing record book and conformity certificates - Gas turbine package incl. auxiliaries (IEC)</w:t>
+              <w:t>Gas Turbine Package incl. Auxiliaries - Manufacturing Record Book and Conformity Certificates</w:t>
             </w:r>
           </w:p>
         </w:tc>
@@ -38341,7 +38379,7 @@
               <w:rPr>
                 <w:sz w:val="14"/>
               </w:rPr>
-              <w:t>Supplier operation and maintenance manual - Steam turbine and condenser (IEC)</w:t>
+              <w:t>Steam Turbine and Condenser - Supplier Operation and Maintenance Manual</w:t>
             </w:r>
           </w:p>
         </w:tc>
@@ -38442,7 +38480,7 @@
               <w:rPr>
                 <w:sz w:val="14"/>
               </w:rPr>
-              <w:t>Factory acceptance test report - Steam turbine and condenser (IEC)</w:t>
+              <w:t>Steam Turbine and Condenser - Factory Acceptance Test Report</w:t>
             </w:r>
           </w:p>
         </w:tc>
@@ -38543,7 +38581,7 @@
               <w:rPr>
                 <w:sz w:val="14"/>
               </w:rPr>
-              <w:t>Manufacturing record book and conformity certificates - Steam turbine and condenser (IEC)</w:t>
+              <w:t>Steam Turbine and Condenser - Manufacturing Record Book and Conformity Certificates</w:t>
             </w:r>
           </w:p>
         </w:tc>
@@ -38644,7 +38682,7 @@
               <w:rPr>
                 <w:sz w:val="14"/>
               </w:rPr>
-              <w:t>Power island operation and maintenance manuals</w:t>
+              <w:t>Gas Turbine Package incl. Auxiliaries - Supplier Operation and Maintenance Manual</w:t>
             </w:r>
           </w:p>
         </w:tc>
@@ -39200,7 +39238,7 @@
               <w:rPr>
                 <w:sz w:val="14"/>
               </w:rPr>
-              <w:t>2027-06-04</w:t>
+              <w:t>2027-06-08</w:t>
             </w:r>
           </w:p>
         </w:tc>
@@ -39455,7 +39493,7 @@
               <w:rPr>
                 <w:sz w:val="14"/>
               </w:rPr>
-              <w:t>EWP-02-PI-01</w:t>
+              <w:t>EWP-01-CV-02</w:t>
             </w:r>
           </w:p>
         </w:tc>
@@ -39471,7 +39509,7 @@
               <w:rPr>
                 <w:sz w:val="14"/>
               </w:rPr>
-              <w:t>CWP-02-PI-01</w:t>
+              <w:t>CWP-01-CV-02</w:t>
             </w:r>
           </w:p>
         </w:tc>
@@ -39487,7 +39525,7 @@
               <w:rPr>
                 <w:sz w:val="14"/>
               </w:rPr>
-              <w:t>ALP-EPC-20LCA-PI-SUP-0001</w:t>
+              <w:t>ALP-EPC-00UBF-CV-RBR-0001</w:t>
             </w:r>
           </w:p>
         </w:tc>
@@ -39503,7 +39541,7 @@
               <w:rPr>
                 <w:sz w:val="14"/>
               </w:rPr>
-              <w:t>2028-04-27</w:t>
+              <w:t>2027-06-21</w:t>
             </w:r>
           </w:p>
         </w:tc>
@@ -39519,7 +39557,7 @@
               <w:rPr>
                 <w:sz w:val="14"/>
               </w:rPr>
-              <w:t>2028-01-31</w:t>
+              <w:t>2027-04-19</w:t>
             </w:r>
           </w:p>
         </w:tc>
@@ -39556,7 +39594,7 @@
               <w:rPr>
                 <w:sz w:val="14"/>
               </w:rPr>
-              <w:t>EWP-07-CV-01</w:t>
+              <w:t>EWP-02-PI-01</w:t>
             </w:r>
           </w:p>
         </w:tc>
@@ -39572,7 +39610,7 @@
               <w:rPr>
                 <w:sz w:val="14"/>
               </w:rPr>
-              <w:t>CWP-07-CV-01</w:t>
+              <w:t>CWP-02-PI-01</w:t>
             </w:r>
           </w:p>
         </w:tc>
@@ -39588,7 +39626,7 @@
               <w:rPr>
                 <w:sz w:val="14"/>
               </w:rPr>
-              <w:t>ALP-EPC-00UGA-CV-EFD-0001</w:t>
+              <w:t>ALP-EPC-20LCA-PI-SUP-0001</w:t>
             </w:r>
           </w:p>
         </w:tc>
@@ -39604,7 +39642,7 @@
               <w:rPr>
                 <w:sz w:val="14"/>
               </w:rPr>
-              <w:t>2027-06-03</w:t>
+              <w:t>2028-04-27</w:t>
             </w:r>
           </w:p>
         </w:tc>
@@ -39620,7 +39658,7 @@
               <w:rPr>
                 <w:sz w:val="14"/>
               </w:rPr>
-              <w:t>2027-04-05</w:t>
+              <w:t>2028-01-31</w:t>
             </w:r>
           </w:p>
         </w:tc>
@@ -39657,7 +39695,7 @@
               <w:rPr>
                 <w:sz w:val="14"/>
               </w:rPr>
-              <w:t>EWP-01-CV-02</w:t>
+              <w:t>EWP-07-CV-01</w:t>
             </w:r>
           </w:p>
         </w:tc>
@@ -39673,7 +39711,7 @@
               <w:rPr>
                 <w:sz w:val="14"/>
               </w:rPr>
-              <w:t>CWP-01-CV-02</w:t>
+              <w:t>CWP-07-CV-01</w:t>
             </w:r>
           </w:p>
         </w:tc>
@@ -39689,7 +39727,7 @@
               <w:rPr>
                 <w:sz w:val="14"/>
               </w:rPr>
-              <w:t>ALP-EPC-00UBF-CV-RBR-0001</w:t>
+              <w:t>ALP-EPC-00UGA-CV-EFD-0001</w:t>
             </w:r>
           </w:p>
         </w:tc>
@@ -39705,7 +39743,7 @@
               <w:rPr>
                 <w:sz w:val="14"/>
               </w:rPr>
-              <w:t>2027-06-21</w:t>
+              <w:t>2027-06-03</w:t>
             </w:r>
           </w:p>
         </w:tc>
@@ -39721,7 +39759,7 @@
               <w:rPr>
                 <w:sz w:val="14"/>
               </w:rPr>
-              <w:t>2027-04-19</w:t>
+              <w:t>2027-04-05</w:t>
             </w:r>
           </w:p>
         </w:tc>
@@ -39737,7 +39775,7 @@
               <w:rPr>
                 <w:sz w:val="14"/>
               </w:rPr>
-              <w:t>13</w:t>
+              <w:t>12</w:t>
             </w:r>
           </w:p>
         </w:tc>
@@ -40061,7 +40099,7 @@
               <w:rPr>
                 <w:sz w:val="14"/>
               </w:rPr>
-              <w:t>EWP-10-CV-01</w:t>
+              <w:t>EWP-01-PI-01</w:t>
             </w:r>
           </w:p>
         </w:tc>
@@ -40077,7 +40115,7 @@
               <w:rPr>
                 <w:sz w:val="14"/>
               </w:rPr>
-              <w:t>CWP-10-CV-01</w:t>
+              <w:t>CWP-01-PI-01</w:t>
             </w:r>
           </w:p>
         </w:tc>
@@ -40093,7 +40131,7 @@
               <w:rPr>
                 <w:sz w:val="14"/>
               </w:rPr>
-              <w:t>ALP-EPC-00UEG-CV-RBR-0001</w:t>
+              <w:t>ALP-EPC-10LAF-PI-SUP-0001</w:t>
             </w:r>
           </w:p>
         </w:tc>
@@ -40109,7 +40147,7 @@
               <w:rPr>
                 <w:sz w:val="14"/>
               </w:rPr>
-              <w:t>2027-06-25</w:t>
+              <w:t>2028-03-02</w:t>
             </w:r>
           </w:p>
         </w:tc>
@@ -40125,7 +40163,7 @@
               <w:rPr>
                 <w:sz w:val="14"/>
               </w:rPr>
-              <w:t>2027-06-03</w:t>
+              <w:t>2027-12-13</w:t>
             </w:r>
           </w:p>
         </w:tc>
@@ -40141,7 +40179,7 @@
               <w:rPr>
                 <w:sz w:val="14"/>
               </w:rPr>
-              <w:t>16</w:t>
+              <w:t>17</w:t>
             </w:r>
           </w:p>
         </w:tc>
@@ -40162,7 +40200,7 @@
               <w:rPr>
                 <w:sz w:val="14"/>
               </w:rPr>
-              <w:t>EWP-01-PI-01</w:t>
+              <w:t>EWP-02-CV-02</w:t>
             </w:r>
           </w:p>
         </w:tc>
@@ -40178,7 +40216,7 @@
               <w:rPr>
                 <w:sz w:val="14"/>
               </w:rPr>
-              <w:t>CWP-01-PI-01</w:t>
+              <w:t>CWP-02-CV-02</w:t>
             </w:r>
           </w:p>
         </w:tc>
@@ -40194,7 +40232,7 @@
               <w:rPr>
                 <w:sz w:val="14"/>
               </w:rPr>
-              <w:t>ALP-EPC-10LAF-PI-SUP-0001</w:t>
+              <w:t>ALP-EPC-20UMB-CV-RBR-0001</w:t>
             </w:r>
           </w:p>
         </w:tc>
@@ -40210,7 +40248,7 @@
               <w:rPr>
                 <w:sz w:val="14"/>
               </w:rPr>
-              <w:t>2028-03-02</w:t>
+              <w:t>2027-06-28</w:t>
             </w:r>
           </w:p>
         </w:tc>
@@ -40226,7 +40264,7 @@
               <w:rPr>
                 <w:sz w:val="14"/>
               </w:rPr>
-              <w:t>2027-12-13</w:t>
+              <w:t>2027-04-19</w:t>
             </w:r>
           </w:p>
         </w:tc>
@@ -40242,7 +40280,7 @@
               <w:rPr>
                 <w:sz w:val="14"/>
               </w:rPr>
-              <w:t>17</w:t>
+              <w:t>18</w:t>
             </w:r>
           </w:p>
         </w:tc>
@@ -40263,7 +40301,7 @@
               <w:rPr>
                 <w:sz w:val="14"/>
               </w:rPr>
-              <w:t>EWP-02-CV-02</w:t>
+              <w:t>EWP-10-CV-01</w:t>
             </w:r>
           </w:p>
         </w:tc>
@@ -40279,7 +40317,7 @@
               <w:rPr>
                 <w:sz w:val="14"/>
               </w:rPr>
-              <w:t>CWP-02-CV-02</w:t>
+              <w:t>CWP-10-CV-01</w:t>
             </w:r>
           </w:p>
         </w:tc>
@@ -40295,7 +40333,7 @@
               <w:rPr>
                 <w:sz w:val="14"/>
               </w:rPr>
-              <w:t>ALP-EPC-20UMB-CV-RBR-0001</w:t>
+              <w:t>ALP-EPC-00UEG-CV-RBR-0001</w:t>
             </w:r>
           </w:p>
         </w:tc>
@@ -40311,7 +40349,7 @@
               <w:rPr>
                 <w:sz w:val="14"/>
               </w:rPr>
-              <w:t>2027-06-28</w:t>
+              <w:t>2027-06-25</w:t>
             </w:r>
           </w:p>
         </w:tc>
@@ -40327,7 +40365,7 @@
               <w:rPr>
                 <w:sz w:val="14"/>
               </w:rPr>
-              <w:t>2027-04-19</w:t>
+              <w:t>2027-06-03</w:t>
             </w:r>
           </w:p>
         </w:tc>
@@ -45516,7 +45554,7 @@
       <w:rPr>
         <w:sz w:val="14"/>
       </w:rPr>
-      <w:t>engine procedures v1.3.0 | data 62297076fe80769d | generated 2026-09-28 - generated from the project database; do not edit</w:t>
+      <w:t>engine procedures v1.4.0 | data 13dbdbeca1a87ab1 | generated 2026-09-28 - generated from the project database; do not edit</w:t>
     </w:r>
   </w:p>
 </w:ftr>

</xml_diff>